<commit_message>
Replace video presentation with About me & skills; drop Toyota from CV
- Portfolio: swap the "Video presentation" slot in the Story section for an
  "About me & my skills" card (short bio + skill chips) matching the dark theme
- CV: remove the Toyota BYY freelance bullet from the HTML, DOCX and regenerate
  the PDF so all three formats stay in sync

Co-Authored-By: Claude Opus 4.8 <noreply@anthropic.com>
Claude-Session: https://claude.ai/code/session_016GBJepJH2uCBQFQXE7m6cc
</commit_message>
<xml_diff>
--- a/cv/Soyli_Sahedova_CV.docx
+++ b/cv/Soyli_Sahedova_CV.docx
@@ -738,55 +738,6 @@
           <w:szCs w:val="21"/>
         </w:rPr>
         <w:t xml:space="preserve">Provide end-to-end graphic design and 2D motion graphics for founders and small businesses, turning briefs into scroll-stopping social creative, ad sets and brand assets.</w:t>
-      </w:r>
-    </w:p>
-    <w:p>
-      <w:pPr>
-        <w:pStyle w:val="ListParagraph"/>
-        <w:numPr>
-          <w:ilvl w:val="0"/>
-          <w:numId w:val="2"/>
-        </w:numPr>
-        <w:spacing w:after="40" w:line="260"/>
-      </w:pPr>
-      <w:r>
-        <w:rPr>
-          <w:rFonts w:ascii="Arial" w:cs="Arial" w:eastAsia="Arial" w:hAnsi="Arial"/>
-          <w:b w:val="false"/>
-          <w:bCs w:val="false"/>
-          <w:i w:val="false"/>
-          <w:iCs w:val="false"/>
-          <w:color w:val="1B1915"/>
-          <w:sz w:val="21"/>
-          <w:szCs w:val="21"/>
-        </w:rPr>
-        <w:t xml:space="preserve">Selected client </w:t>
-      </w:r>
-      <w:r>
-        <w:rPr>
-          <w:rFonts w:ascii="Arial" w:cs="Arial" w:eastAsia="Arial" w:hAnsi="Arial"/>
-          <w:b/>
-          <w:bCs/>
-          <w:i w:val="false"/>
-          <w:iCs w:val="false"/>
-          <w:color w:val="1B1915"/>
-          <w:sz w:val="21"/>
-          <w:szCs w:val="21"/>
-        </w:rPr>
-        <w:t xml:space="preserve">Toyota BYY (@toyota_byy)</w:t>
-      </w:r>
-      <w:r>
-        <w:rPr>
-          <w:rFonts w:ascii="Arial" w:cs="Arial" w:eastAsia="Arial" w:hAnsi="Arial"/>
-          <w:b w:val="false"/>
-          <w:bCs w:val="false"/>
-          <w:i w:val="false"/>
-          <w:iCs w:val="false"/>
-          <w:color w:val="1B1915"/>
-          <w:sz w:val="21"/>
-          <w:szCs w:val="21"/>
-        </w:rPr>
-        <w:t xml:space="preserve">: designed posts and ad creatives and set up Meta (Instagram &amp; Facebook) ad campaigns — audiences, placements and budgets — driving reach and engagement.</w:t>
       </w:r>
     </w:p>
     <w:p>

</xml_diff>

<commit_message>
CV certs + portfolio insights, creative About-me, removals
CV:
- Add three Coursera certifications (Google, Illinois Tech, IBM) with credential IDs
- Remove "Reddit outreach" from the SalesShortcut bullet
- Regenerate PDF; refresh embedded Download CV PDF in portfolio

Portfolio:
- Rework Story section into a single, more creative "About me" card; remove the
  Personal story card
- Update SalesShortcut case metrics to the real Instagram Insights figures
  (2.8K views +298%, 932 reach +396%, 205 interactions +181%)
- Remove the "Meta · organic reach" block

Co-Authored-By: Claude Opus 4.8 <noreply@anthropic.com>
Claude-Session: https://claude.ai/code/session_016GBJepJH2uCBQFQXE7m6cc
</commit_message>
<xml_diff>
--- a/cv/Soyli_Sahedova_CV.docx
+++ b/cv/Soyli_Sahedova_CV.docx
@@ -486,7 +486,7 @@
           <w:sz w:val="21"/>
           <w:szCs w:val="21"/>
         </w:rPr>
-        <w:t xml:space="preserve"> through organic social and Reddit outreach.</w:t>
+        <w:t xml:space="preserve"> through organic social.</w:t>
       </w:r>
     </w:p>
     <w:p>
@@ -1172,20 +1172,92 @@
           <w:sz w:val="21"/>
           <w:szCs w:val="21"/>
         </w:rPr>
-        <w:t xml:space="preserve">Google Digital Marketing Certificate</w:t>
-      </w:r>
-      <w:r>
-        <w:rPr>
-          <w:rFonts w:ascii="Arial" w:cs="Arial" w:eastAsia="Arial" w:hAnsi="Arial"/>
-          <w:b w:val="false"/>
-          <w:bCs w:val="false"/>
-          <w:i w:val="false"/>
-          <w:iCs w:val="false"/>
-          <w:color w:val="1B1915"/>
-          <w:sz w:val="21"/>
-          <w:szCs w:val="21"/>
-        </w:rPr>
-        <w:t xml:space="preserve"> — Coursera. SEO, paid media, analytics, email marketing and full-funnel strategy (two certificates earned).</w:t>
+        <w:t xml:space="preserve">Foundations of Digital Marketing and E-commerce</w:t>
+      </w:r>
+      <w:r>
+        <w:rPr>
+          <w:rFonts w:ascii="Arial" w:cs="Arial" w:eastAsia="Arial" w:hAnsi="Arial"/>
+          <w:b w:val="false"/>
+          <w:bCs w:val="false"/>
+          <w:i w:val="false"/>
+          <w:iCs w:val="false"/>
+          <w:color w:val="1B1915"/>
+          <w:sz w:val="21"/>
+          <w:szCs w:val="21"/>
+        </w:rPr>
+        <w:t xml:space="preserve"> — Google, via Coursera (Jul 2026) · Credential ID 87MSN1234K9L</w:t>
+      </w:r>
+    </w:p>
+    <w:p>
+      <w:pPr>
+        <w:pStyle w:val="ListParagraph"/>
+        <w:numPr>
+          <w:ilvl w:val="0"/>
+          <w:numId w:val="2"/>
+        </w:numPr>
+        <w:spacing w:after="40" w:line="260"/>
+      </w:pPr>
+      <w:r>
+        <w:rPr>
+          <w:rFonts w:ascii="Arial" w:cs="Arial" w:eastAsia="Arial" w:hAnsi="Arial"/>
+          <w:b/>
+          <w:bCs/>
+          <w:i w:val="false"/>
+          <w:iCs w:val="false"/>
+          <w:color w:val="1B1915"/>
+          <w:sz w:val="21"/>
+          <w:szCs w:val="21"/>
+        </w:rPr>
+        <w:t xml:space="preserve">Digital Marketing</w:t>
+      </w:r>
+      <w:r>
+        <w:rPr>
+          <w:rFonts w:ascii="Arial" w:cs="Arial" w:eastAsia="Arial" w:hAnsi="Arial"/>
+          <w:b w:val="false"/>
+          <w:bCs w:val="false"/>
+          <w:i w:val="false"/>
+          <w:iCs w:val="false"/>
+          <w:color w:val="1B1915"/>
+          <w:sz w:val="21"/>
+          <w:szCs w:val="21"/>
+        </w:rPr>
+        <w:t xml:space="preserve"> — Illinois Tech, via Coursera (Jul 2026) · Credential ID Y6LUWHGLYZ0W</w:t>
+      </w:r>
+    </w:p>
+    <w:p>
+      <w:pPr>
+        <w:pStyle w:val="ListParagraph"/>
+        <w:numPr>
+          <w:ilvl w:val="0"/>
+          <w:numId w:val="2"/>
+        </w:numPr>
+        <w:spacing w:after="40" w:line="260"/>
+      </w:pPr>
+      <w:r>
+        <w:rPr>
+          <w:rFonts w:ascii="Arial" w:cs="Arial" w:eastAsia="Arial" w:hAnsi="Arial"/>
+          <w:b/>
+          <w:bCs/>
+          <w:i w:val="false"/>
+          <w:iCs w:val="false"/>
+          <w:color w:val="1B1915"/>
+          <w:sz w:val="21"/>
+          <w:szCs w:val="21"/>
+        </w:rPr>
+        <w:t xml:space="preserve">Capstone Project: Digital Marketing and Growth Hacking</w:t>
+      </w:r>
+      <w:r>
+        <w:rPr>
+          <w:rFonts w:ascii="Arial" w:cs="Arial" w:eastAsia="Arial" w:hAnsi="Arial"/>
+          <w:b w:val="false"/>
+          <w:bCs w:val="false"/>
+          <w:i w:val="false"/>
+          <w:iCs w:val="false"/>
+          <w:color w:val="1B1915"/>
+          <w:sz w:val="21"/>
+          <w:szCs w:val="21"/>
+        </w:rPr>
+        <w:t xml:space="preserve"> — IBM, via Coursera (Jul 2026) · Credential ID KNU8XV50HUZX</w:t>
       </w:r>
     </w:p>
     <w:p>

</xml_diff>

<commit_message>
CV: trim Key Achievements to Employee of the Year only
Remove the stats bullet and the AI-automation bullet from Key Achievements,
leaving just the Employee of the Year award. Regenerate PDF and refresh the
embedded Download CV PDF in the portfolio.

Co-Authored-By: Claude Opus 4.8 <noreply@anthropic.com>
Claude-Session: https://claude.ai/code/session_016GBJepJH2uCBQFQXE7m6cc
</commit_message>
<xml_diff>
--- a/cv/Soyli_Sahedova_CV.docx
+++ b/cv/Soyli_Sahedova_CV.docx
@@ -970,104 +970,6 @@
           <w:szCs w:val="21"/>
         </w:rPr>
         <w:t xml:space="preserve"> — recognized for consistent, high-impact delivery and reliability.</w:t>
-      </w:r>
-    </w:p>
-    <w:p>
-      <w:pPr>
-        <w:pStyle w:val="ListParagraph"/>
-        <w:numPr>
-          <w:ilvl w:val="0"/>
-          <w:numId w:val="2"/>
-        </w:numPr>
-        <w:spacing w:after="40" w:line="260"/>
-      </w:pPr>
-      <w:r>
-        <w:rPr>
-          <w:rFonts w:ascii="Arial" w:cs="Arial" w:eastAsia="Arial" w:hAnsi="Arial"/>
-          <w:b w:val="false"/>
-          <w:bCs w:val="false"/>
-          <w:i w:val="false"/>
-          <w:iCs w:val="false"/>
-          <w:color w:val="1B1915"/>
-          <w:sz w:val="21"/>
-          <w:szCs w:val="21"/>
-        </w:rPr>
-        <w:t xml:space="preserve">Scaled a US SaaS brand's social presence from zero to </w:t>
-      </w:r>
-      <w:r>
-        <w:rPr>
-          <w:rFonts w:ascii="Arial" w:cs="Arial" w:eastAsia="Arial" w:hAnsi="Arial"/>
-          <w:b/>
-          <w:bCs/>
-          <w:i w:val="false"/>
-          <w:iCs w:val="false"/>
-          <w:color w:val="1B1915"/>
-          <w:sz w:val="21"/>
-          <w:szCs w:val="21"/>
-        </w:rPr>
-        <w:t xml:space="preserve">+2,300% profile activity</w:t>
-      </w:r>
-      <w:r>
-        <w:rPr>
-          <w:rFonts w:ascii="Arial" w:cs="Arial" w:eastAsia="Arial" w:hAnsi="Arial"/>
-          <w:b w:val="false"/>
-          <w:bCs w:val="false"/>
-          <w:i w:val="false"/>
-          <w:iCs w:val="false"/>
-          <w:color w:val="1B1915"/>
-          <w:sz w:val="21"/>
-          <w:szCs w:val="21"/>
-        </w:rPr>
-        <w:t xml:space="preserve"> and </w:t>
-      </w:r>
-      <w:r>
-        <w:rPr>
-          <w:rFonts w:ascii="Arial" w:cs="Arial" w:eastAsia="Arial" w:hAnsi="Arial"/>
-          <w:b/>
-          <w:bCs/>
-          <w:i w:val="false"/>
-          <w:iCs w:val="false"/>
-          <w:color w:val="1B1915"/>
-          <w:sz w:val="21"/>
-          <w:szCs w:val="21"/>
-        </w:rPr>
-        <w:t xml:space="preserve">+684.9% impressions</w:t>
-      </w:r>
-      <w:r>
-        <w:rPr>
-          <w:rFonts w:ascii="Arial" w:cs="Arial" w:eastAsia="Arial" w:hAnsi="Arial"/>
-          <w:b w:val="false"/>
-          <w:bCs w:val="false"/>
-          <w:i w:val="false"/>
-          <w:iCs w:val="false"/>
-          <w:color w:val="1B1915"/>
-          <w:sz w:val="21"/>
-          <w:szCs w:val="21"/>
-        </w:rPr>
-        <w:t xml:space="preserve"> in 30 days.</w:t>
-      </w:r>
-    </w:p>
-    <w:p>
-      <w:pPr>
-        <w:pStyle w:val="ListParagraph"/>
-        <w:numPr>
-          <w:ilvl w:val="0"/>
-          <w:numId w:val="2"/>
-        </w:numPr>
-        <w:spacing w:after="40" w:line="260"/>
-      </w:pPr>
-      <w:r>
-        <w:rPr>
-          <w:rFonts w:ascii="Arial" w:cs="Arial" w:eastAsia="Arial" w:hAnsi="Arial"/>
-          <w:b w:val="false"/>
-          <w:bCs w:val="false"/>
-          <w:i w:val="false"/>
-          <w:iCs w:val="false"/>
-          <w:color w:val="1B1915"/>
-          <w:sz w:val="21"/>
-          <w:szCs w:val="21"/>
-        </w:rPr>
-        <w:t xml:space="preserve">Built AI marketing-automation workflows (n8n + Google Gemini) that generate lead lists, personalized outreach and full growth plans automatically.</w:t>
       </w:r>
     </w:p>
     <w:p>

</xml_diff>

<commit_message>
Insights: percentage as primary figure; restore +684.9% LinkedIn reach
Portfolio + CV: show the growth percentage as the big/primary number with the
absolute count in the label. Restore +684.9% LinkedIn reach and add the
Instagram Insights figures (+396% reach/932, +298% views/2.8K, +181%
interactions/205).

- Portfolio SalesShortcut case study: 4 percent-first metric cards
- Portfolio hero: +684.9% LinkedIn reach and +396% Instagram reach
- CV Professional Experience bullet rewritten percent-first (HTML + DOCX)
- Regenerate PDF; refresh embedded Download CV PDF

Co-Authored-By: Claude Opus 4.8 <noreply@anthropic.com>
Claude-Session: https://claude.ai/code/session_016GBJepJH2uCBQFQXE7m6cc
</commit_message>
<xml_diff>
--- a/cv/Soyli_Sahedova_CV.docx
+++ b/cv/Soyli_Sahedova_CV.docx
@@ -395,98 +395,98 @@
           <w:sz w:val="21"/>
           <w:szCs w:val="21"/>
         </w:rPr>
-        <w:t xml:space="preserve">+684.9% LinkedIn impressions in 30 days</w:t>
-      </w:r>
-      <w:r>
-        <w:rPr>
-          <w:rFonts w:ascii="Arial" w:cs="Arial" w:eastAsia="Arial" w:hAnsi="Arial"/>
-          <w:b w:val="false"/>
-          <w:bCs w:val="false"/>
-          <w:i w:val="false"/>
-          <w:iCs w:val="false"/>
-          <w:color w:val="1B1915"/>
-          <w:sz w:val="21"/>
-          <w:szCs w:val="21"/>
-        </w:rPr>
-        <w:t xml:space="preserve">, </w:t>
-      </w:r>
-      <w:r>
-        <w:rPr>
-          <w:rFonts w:ascii="Arial" w:cs="Arial" w:eastAsia="Arial" w:hAnsi="Arial"/>
-          <w:b/>
-          <w:bCs/>
-          <w:i w:val="false"/>
-          <w:iCs w:val="false"/>
-          <w:color w:val="1B1915"/>
-          <w:sz w:val="21"/>
-          <w:szCs w:val="21"/>
-        </w:rPr>
-        <w:t xml:space="preserve">5.6% engagement rate</w:t>
-      </w:r>
-      <w:r>
-        <w:rPr>
-          <w:rFonts w:ascii="Arial" w:cs="Arial" w:eastAsia="Arial" w:hAnsi="Arial"/>
-          <w:b w:val="false"/>
-          <w:bCs w:val="false"/>
-          <w:i w:val="false"/>
-          <w:iCs w:val="false"/>
-          <w:color w:val="1B1915"/>
-          <w:sz w:val="21"/>
-          <w:szCs w:val="21"/>
-        </w:rPr>
-        <w:t xml:space="preserve">, </w:t>
-      </w:r>
-      <w:r>
-        <w:rPr>
-          <w:rFonts w:ascii="Arial" w:cs="Arial" w:eastAsia="Arial" w:hAnsi="Arial"/>
-          <w:b/>
-          <w:bCs/>
-          <w:i w:val="false"/>
-          <w:iCs w:val="false"/>
-          <w:color w:val="1B1915"/>
-          <w:sz w:val="21"/>
-          <w:szCs w:val="21"/>
-        </w:rPr>
-        <w:t xml:space="preserve">+2,300% Instagram profile activity</w:t>
-      </w:r>
-      <w:r>
-        <w:rPr>
-          <w:rFonts w:ascii="Arial" w:cs="Arial" w:eastAsia="Arial" w:hAnsi="Arial"/>
-          <w:b w:val="false"/>
-          <w:bCs w:val="false"/>
-          <w:i w:val="false"/>
-          <w:iCs w:val="false"/>
-          <w:color w:val="1B1915"/>
-          <w:sz w:val="21"/>
-          <w:szCs w:val="21"/>
-        </w:rPr>
-        <w:t xml:space="preserve"> and </w:t>
-      </w:r>
-      <w:r>
-        <w:rPr>
-          <w:rFonts w:ascii="Arial" w:cs="Arial" w:eastAsia="Arial" w:hAnsi="Arial"/>
-          <w:b/>
-          <w:bCs/>
-          <w:i w:val="false"/>
-          <w:iCs w:val="false"/>
-          <w:color w:val="1B1915"/>
-          <w:sz w:val="21"/>
-          <w:szCs w:val="21"/>
-        </w:rPr>
-        <w:t xml:space="preserve">+3,033% profile visits</w:t>
-      </w:r>
-      <w:r>
-        <w:rPr>
-          <w:rFonts w:ascii="Arial" w:cs="Arial" w:eastAsia="Arial" w:hAnsi="Arial"/>
-          <w:b w:val="false"/>
-          <w:bCs w:val="false"/>
-          <w:i w:val="false"/>
-          <w:iCs w:val="false"/>
-          <w:color w:val="1B1915"/>
-          <w:sz w:val="21"/>
-          <w:szCs w:val="21"/>
-        </w:rPr>
-        <w:t xml:space="preserve"> through organic social.</w:t>
+        <w:t xml:space="preserve">+684.9% LinkedIn reach</w:t>
+      </w:r>
+      <w:r>
+        <w:rPr>
+          <w:rFonts w:ascii="Arial" w:cs="Arial" w:eastAsia="Arial" w:hAnsi="Arial"/>
+          <w:b w:val="false"/>
+          <w:bCs w:val="false"/>
+          <w:i w:val="false"/>
+          <w:iCs w:val="false"/>
+          <w:color w:val="1B1915"/>
+          <w:sz w:val="21"/>
+          <w:szCs w:val="21"/>
+        </w:rPr>
+        <w:t xml:space="preserve"> in 30 days, plus </w:t>
+      </w:r>
+      <w:r>
+        <w:rPr>
+          <w:rFonts w:ascii="Arial" w:cs="Arial" w:eastAsia="Arial" w:hAnsi="Arial"/>
+          <w:b/>
+          <w:bCs/>
+          <w:i w:val="false"/>
+          <w:iCs w:val="false"/>
+          <w:color w:val="1B1915"/>
+          <w:sz w:val="21"/>
+          <w:szCs w:val="21"/>
+        </w:rPr>
+        <w:t xml:space="preserve">+396% Instagram reach</w:t>
+      </w:r>
+      <w:r>
+        <w:rPr>
+          <w:rFonts w:ascii="Arial" w:cs="Arial" w:eastAsia="Arial" w:hAnsi="Arial"/>
+          <w:b w:val="false"/>
+          <w:bCs w:val="false"/>
+          <w:i w:val="false"/>
+          <w:iCs w:val="false"/>
+          <w:color w:val="1B1915"/>
+          <w:sz w:val="21"/>
+          <w:szCs w:val="21"/>
+        </w:rPr>
+        <w:t xml:space="preserve"> (932 accounts), </w:t>
+      </w:r>
+      <w:r>
+        <w:rPr>
+          <w:rFonts w:ascii="Arial" w:cs="Arial" w:eastAsia="Arial" w:hAnsi="Arial"/>
+          <w:b/>
+          <w:bCs/>
+          <w:i w:val="false"/>
+          <w:iCs w:val="false"/>
+          <w:color w:val="1B1915"/>
+          <w:sz w:val="21"/>
+          <w:szCs w:val="21"/>
+        </w:rPr>
+        <w:t xml:space="preserve">+298% content views</w:t>
+      </w:r>
+      <w:r>
+        <w:rPr>
+          <w:rFonts w:ascii="Arial" w:cs="Arial" w:eastAsia="Arial" w:hAnsi="Arial"/>
+          <w:b w:val="false"/>
+          <w:bCs w:val="false"/>
+          <w:i w:val="false"/>
+          <w:iCs w:val="false"/>
+          <w:color w:val="1B1915"/>
+          <w:sz w:val="21"/>
+          <w:szCs w:val="21"/>
+        </w:rPr>
+        <w:t xml:space="preserve"> (2.8K) and </w:t>
+      </w:r>
+      <w:r>
+        <w:rPr>
+          <w:rFonts w:ascii="Arial" w:cs="Arial" w:eastAsia="Arial" w:hAnsi="Arial"/>
+          <w:b/>
+          <w:bCs/>
+          <w:i w:val="false"/>
+          <w:iCs w:val="false"/>
+          <w:color w:val="1B1915"/>
+          <w:sz w:val="21"/>
+          <w:szCs w:val="21"/>
+        </w:rPr>
+        <w:t xml:space="preserve">+181% content interactions</w:t>
+      </w:r>
+      <w:r>
+        <w:rPr>
+          <w:rFonts w:ascii="Arial" w:cs="Arial" w:eastAsia="Arial" w:hAnsi="Arial"/>
+          <w:b w:val="false"/>
+          <w:bCs w:val="false"/>
+          <w:i w:val="false"/>
+          <w:iCs w:val="false"/>
+          <w:color w:val="1B1915"/>
+          <w:sz w:val="21"/>
+          <w:szCs w:val="21"/>
+        </w:rPr>
+        <w:t xml:space="preserve"> (205) — all through organic social.</w:t>
       </w:r>
     </w:p>
     <w:p>

</xml_diff>

<commit_message>
CV: add EF SET C2 English certificate; simplify ODM variant for clarity
- Added EF SET English Certificate (C2 Proficient, 86/100) to both CVs — in
  Certifications (with verify link) and Languages (English upgraded to C2)
- Rewrote the ODM variant in plain, simple English so an ESL/Vietnamese hiring
  team reads it easily; kept it to one page
- Master CV kept general; both one page

Co-Authored-By: Claude Opus 4.8 <noreply@anthropic.com>
Claude-Session: https://claude.ai/code/session_016GBJepJH2uCBQFQXE7m6cc
</commit_message>
<xml_diff>
--- a/cv/Soyli_Sahedova_CV.docx
+++ b/cv/Soyli_Sahedova_CV.docx
@@ -778,6 +778,35 @@
     <w:p>
       <w:pPr>
         <w:pStyle w:val="ListBullet"/>
+        <w:spacing w:after="20" w:line="252" w:lineRule="auto"/>
+      </w:pPr>
+      <w:r>
+        <w:rPr>
+          <w:b/>
+          <w:sz w:val="19"/>
+        </w:rPr>
+        <w:t>EF SET English Certificate — C2 Proficient (86/100)</w:t>
+      </w:r>
+      <w:r>
+        <w:rPr>
+          <w:sz w:val="19"/>
+        </w:rPr>
+        <w:t xml:space="preserve"> — EF Standard English Test, Aug 2026 · </w:t>
+      </w:r>
+      <w:hyperlink r:id="rId13">
+        <w:r>
+          <w:rPr>
+            <w:color w:val="8A6414"/>
+            <w:u w:val="single"/>
+            <w:sz w:val="18"/>
+          </w:rPr>
+          <w:t xml:space="preserve">cert.efset.org/chQboN</w:t>
+        </w:r>
+      </w:hyperlink>
+    </w:p>
+    <w:p>
+      <w:pPr>
+        <w:pStyle w:val="ListBullet"/>
         <w:spacing w:before="0" w:after="20"/>
       </w:pPr>
       <w:r>
@@ -906,7 +935,7 @@
           <w:color w:val="1B1915"/>
           <w:sz w:val="19"/>
         </w:rPr>
-        <w:t>English — Professional working · Turkmen — Native · Russian — Fluent · Turkish — Fluent</w:t>
+        <w:t>English — C2 Proficient (EF SET 86/100) · Turkmen — Native · Russian — Fluent · Turkish — Fluent</w:t>
       </w:r>
     </w:p>
     <w:sectPr>

</xml_diff>

<commit_message>
CV: update phone to +84 931 806 573; add On-site / Hybrid / Remote
New Vietnamese phone number and all three work modes (On-site / Hybrid /
Remote) on both CVs, all three formats.

Co-Authored-By: Claude Opus 4.8 <noreply@anthropic.com>
Claude-Session: https://claude.ai/code/session_016GBJepJH2uCBQFQXE7m6cc
</commit_message>
<xml_diff>
--- a/cv/Soyli_Sahedova_CV.docx
+++ b/cv/Soyli_Sahedova_CV.docx
@@ -69,7 +69,7 @@
           <w:color w:val="1B1915"/>
           <w:sz w:val="18"/>
         </w:rPr>
-        <w:t>+993 65 82-11-18</w:t>
+        <w:t>+84 931 806 573</w:t>
       </w:r>
     </w:p>
     <w:p>
@@ -92,7 +92,7 @@
           <w:color w:val="1B1915"/>
           <w:sz w:val="18"/>
         </w:rPr>
-        <w:t>Ho Chi Minh City, Vietnam — Open to Remote / Worldwide</w:t>
+        <w:t>Ho Chi Minh City, Vietnam — On-site / Hybrid / Remote</w:t>
       </w:r>
     </w:p>
     <w:p>

</xml_diff>

<commit_message>
CV: add editable Portfolio link (placeholder) to all variants
Added a "Portfolio: (link coming soon)" line to master, ODM and Autonomous CVs
(all three formats). Placeholder is easy to find and replace in the DOCX once
the portfolio URL is published. All CVs remain one page.

Co-Authored-By: Claude Opus 4.8 <noreply@anthropic.com>
Claude-Session: https://claude.ai/code/session_016GBJepJH2uCBQFQXE7m6cc
</commit_message>
<xml_diff>
--- a/cv/Soyli_Sahedova_CV.docx
+++ b/cv/Soyli_Sahedova_CV.docx
@@ -137,6 +137,20 @@
           <w:t xml:space="preserve">https://behance.net/soylisahedova</w:t>
         </w:r>
       </w:hyperlink>
+      <w:r>
+        <w:rPr>
+          <w:b/>
+          <w:sz w:val="18"/>
+        </w:rPr>
+        <w:t xml:space="preserve">   ·   Portfolio: </w:t>
+      </w:r>
+      <w:r>
+        <w:rPr>
+          <w:color w:val="867F72"/>
+          <w:sz w:val="18"/>
+        </w:rPr>
+        <w:t>(link coming soon)</w:t>
+      </w:r>
     </w:p>
     <w:p>
       <w:pPr>

</xml_diff>

<commit_message>
CV: set Portfolio link to soylishportfolio.netlify.app
Replaced the placeholder with the live portfolio URL (clickable) across master,
ODM and Autonomous CVs, all three formats. Still one page each.

Co-Authored-By: Claude Opus 4.8 <noreply@anthropic.com>
Claude-Session: https://claude.ai/code/session_016GBJepJH2uCBQFQXE7m6cc
</commit_message>
<xml_diff>
--- a/cv/Soyli_Sahedova_CV.docx
+++ b/cv/Soyli_Sahedova_CV.docx
@@ -149,8 +149,17 @@
           <w:color w:val="867F72"/>
           <w:sz w:val="18"/>
         </w:rPr>
-        <w:t>(link coming soon)</w:t>
       </w:r>
+      <w:hyperlink r:id="rId14">
+        <w:r>
+          <w:rPr>
+            <w:color w:val="8A6414"/>
+            <w:u w:val="single"/>
+            <w:sz w:val="18"/>
+          </w:rPr>
+          <w:t xml:space="preserve">https://soylishportfolio.netlify.app</w:t>
+        </w:r>
+      </w:hyperlink>
     </w:p>
     <w:p>
       <w:pPr>

</xml_diff>

<commit_message>
Rebuild master CV: white background, ATS-clean layout
Remade the master CV on a plain white background with a standard single-column,
ATS-friendly layout (removed the cream gradient and animated background,
standard section headings, real text bullets, clickable https links, standard
fonts). Kept n8n, removed Google Gemini for consistency. One page.

Co-Authored-By: Claude Opus 4.8 <noreply@anthropic.com>
Claude-Session: https://claude.ai/code/session_016GBJepJH2uCBQFQXE7m6cc
</commit_message>
<xml_diff>
--- a/cv/Soyli_Sahedova_CV.docx
+++ b/cv/Soyli_Sahedova_CV.docx
@@ -10,10 +10,10 @@
         <w:rPr>
           <w:b/>
           <w:i w:val="0"/>
-          <w:color w:val="1B1915"/>
+          <w:color w:val="1A1A1A"/>
           <w:sz w:val="40"/>
         </w:rPr>
-        <w:t>SOYLI (SOPHIE) SAHEDOVA</w:t>
+        <w:t>Soyli (Sophie) Sahedova</w:t>
       </w:r>
     </w:p>
     <w:p>
@@ -24,7 +24,7 @@
         <w:rPr>
           <w:b/>
           <w:i w:val="0"/>
-          <w:color w:val="8A6414"/>
+          <w:color w:val="333333"/>
           <w:sz w:val="22"/>
         </w:rPr>
         <w:t>Digital Marketing Specialist · Graphic &amp; Motion Designer</w:t>
@@ -32,13 +32,13 @@
     </w:p>
     <w:p>
       <w:pPr>
-        <w:spacing w:before="0" w:after="0" w:line="252" w:lineRule="auto"/>
+        <w:spacing w:before="0" w:after="0" w:line="264" w:lineRule="auto"/>
       </w:pPr>
       <w:r>
         <w:rPr>
           <w:b/>
           <w:i w:val="0"/>
-          <w:color w:val="1B1915"/>
+          <w:color w:val="1A1A1A"/>
           <w:sz w:val="18"/>
         </w:rPr>
         <w:t xml:space="preserve">Email: </w:t>
@@ -46,7 +46,7 @@
       <w:hyperlink r:id="rId9">
         <w:r>
           <w:rPr>
-            <w:color w:val="8A6414"/>
+            <w:color w:val="12457A"/>
             <w:u w:val="single"/>
             <w:sz w:val="18"/>
           </w:rPr>
@@ -57,16 +57,16 @@
         <w:rPr>
           <w:b/>
           <w:i w:val="0"/>
-          <w:color w:val="1B1915"/>
+          <w:color w:val="1A1A1A"/>
           <w:sz w:val="18"/>
         </w:rPr>
-        <w:t xml:space="preserve">   ·   Phone: </w:t>
+        <w:t xml:space="preserve">   |   Phone: </w:t>
       </w:r>
       <w:r>
         <w:rPr>
           <w:b w:val="0"/>
           <w:i w:val="0"/>
-          <w:color w:val="1B1915"/>
+          <w:color w:val="333333"/>
           <w:sz w:val="18"/>
         </w:rPr>
         <w:t>+84 931 806 573</w:t>
@@ -74,13 +74,13 @@
     </w:p>
     <w:p>
       <w:pPr>
-        <w:spacing w:before="0" w:after="0" w:line="252" w:lineRule="auto"/>
+        <w:spacing w:before="0" w:after="0" w:line="264" w:lineRule="auto"/>
       </w:pPr>
       <w:r>
         <w:rPr>
           <w:b/>
           <w:i w:val="0"/>
-          <w:color w:val="1B1915"/>
+          <w:color w:val="1A1A1A"/>
           <w:sz w:val="18"/>
         </w:rPr>
         <w:t xml:space="preserve">Location: </w:t>
@@ -89,7 +89,7 @@
         <w:rPr>
           <w:b w:val="0"/>
           <w:i w:val="0"/>
-          <w:color w:val="1B1915"/>
+          <w:color w:val="333333"/>
           <w:sz w:val="18"/>
         </w:rPr>
         <w:t>Ho Chi Minh City, Vietnam — On-site / Hybrid / Remote</w:t>
@@ -97,106 +97,78 @@
     </w:p>
     <w:p>
       <w:pPr>
-        <w:spacing w:before="0" w:after="0" w:line="252" w:lineRule="auto"/>
+        <w:spacing w:before="0" w:after="40" w:line="264" w:lineRule="auto"/>
       </w:pPr>
       <w:r>
         <w:rPr>
           <w:b/>
           <w:i w:val="0"/>
-          <w:color w:val="1B1915"/>
+          <w:color w:val="1A1A1A"/>
           <w:sz w:val="18"/>
         </w:rPr>
-        <w:t xml:space="preserve">LinkedIn: </w:t>
+        <w:t xml:space="preserve">Portfolio: </w:t>
       </w:r>
       <w:hyperlink r:id="rId10">
         <w:r>
           <w:rPr>
-            <w:color w:val="8A6414"/>
+            <w:color w:val="12457A"/>
             <w:u w:val="single"/>
             <w:sz w:val="18"/>
           </w:rPr>
-          <w:t xml:space="preserve">https://linkedin.com/in/soyli-sahedova</w:t>
+          <w:t xml:space="preserve">soylishportfolio.netlify.app</w:t>
         </w:r>
       </w:hyperlink>
       <w:r>
         <w:rPr>
           <w:b/>
           <w:i w:val="0"/>
-          <w:color w:val="1B1915"/>
+          <w:color w:val="1A1A1A"/>
           <w:sz w:val="18"/>
         </w:rPr>
-        <w:t xml:space="preserve">   ·   Behance: </w:t>
+        <w:t xml:space="preserve">   |   LinkedIn: </w:t>
       </w:r>
       <w:hyperlink r:id="rId11">
         <w:r>
           <w:rPr>
-            <w:color w:val="8A6414"/>
+            <w:color w:val="12457A"/>
             <w:u w:val="single"/>
             <w:sz w:val="18"/>
           </w:rPr>
-          <w:t xml:space="preserve">https://behance.net/soylisahedova</w:t>
+          <w:t xml:space="preserve">linkedin.com/in/soyli-sahedova</w:t>
         </w:r>
       </w:hyperlink>
       <w:r>
         <w:rPr>
           <w:b/>
+          <w:i w:val="0"/>
+          <w:color w:val="1A1A1A"/>
           <w:sz w:val="18"/>
         </w:rPr>
-        <w:t xml:space="preserve">   ·   Portfolio: </w:t>
+        <w:t xml:space="preserve">   |   Behance: </w:t>
       </w:r>
-      <w:r>
-        <w:rPr>
-          <w:color w:val="867F72"/>
-          <w:sz w:val="18"/>
-        </w:rPr>
-      </w:r>
-      <w:hyperlink r:id="rId14">
+      <w:hyperlink r:id="rId12">
         <w:r>
           <w:rPr>
-            <w:color w:val="8A6414"/>
+            <w:color w:val="12457A"/>
             <w:u w:val="single"/>
             <w:sz w:val="18"/>
           </w:rPr>
-          <w:t xml:space="preserve">https://soylishportfolio.netlify.app</w:t>
+          <w:t xml:space="preserve">behance.net/soylisahedova</w:t>
         </w:r>
       </w:hyperlink>
     </w:p>
     <w:p>
       <w:pPr>
-        <w:spacing w:before="0" w:after="40" w:line="252" w:lineRule="auto"/>
-      </w:pPr>
-      <w:r>
-        <w:rPr>
-          <w:b/>
-          <w:i w:val="0"/>
-          <w:color w:val="1B1915"/>
-          <w:sz w:val="18"/>
-        </w:rPr>
-        <w:t xml:space="preserve">Instagram: </w:t>
-      </w:r>
-      <w:hyperlink r:id="rId12">
-        <w:r>
-          <w:rPr>
-            <w:color w:val="8A6414"/>
-            <w:u w:val="single"/>
-            <w:sz w:val="18"/>
-          </w:rPr>
-          <w:t xml:space="preserve">https://instagram.com/soyli_s_11</w:t>
-        </w:r>
-      </w:hyperlink>
-    </w:p>
-    <w:p>
-      <w:pPr>
-        <w:spacing w:before="180" w:after="60"/>
+        <w:spacing w:before="160" w:after="60"/>
         <w:pBdr>
-          <w:bottom w:val="single" w:sz="6" w:space="2" w:color="b4892c"/>
+          <w:bottom w:val="single" w:sz="6" w:space="2" w:color="c9c9c9"/>
         </w:pBdr>
       </w:pPr>
       <w:r>
         <w:rPr>
           <w:b/>
           <w:i w:val="0"/>
-          <w:color w:val="1B1915"/>
+          <w:color w:val="1A1A1A"/>
           <w:sz w:val="22"/>
         </w:rPr>
         <w:t>PROFESSIONAL SUMMARY</w:t>
@@ -210,7 +182,7 @@
         <w:rPr>
           <w:b w:val="0"/>
           <w:i w:val="0"/>
-          <w:color w:val="1B1915"/>
+          <w:color w:val="333333"/>
           <w:sz w:val="19"/>
         </w:rPr>
         <w:t xml:space="preserve">Digital marketing specialist and designer with </w:t>
@@ -219,7 +191,7 @@
         <w:rPr>
           <w:b/>
           <w:i w:val="0"/>
-          <w:color w:val="1B1915"/>
+          <w:color w:val="333333"/>
           <w:sz w:val="19"/>
         </w:rPr>
         <w:t>5+ years of experience</w:t>
@@ -228,7 +200,7 @@
         <w:rPr>
           <w:b w:val="0"/>
           <w:i w:val="0"/>
-          <w:color w:val="1B1915"/>
+          <w:color w:val="333333"/>
           <w:sz w:val="19"/>
         </w:rPr>
         <w:t xml:space="preserve"> who owns the whole journey from strategy to sales — I build the </w:t>
@@ -237,7 +209,7 @@
         <w:rPr>
           <w:b/>
           <w:i w:val="0"/>
-          <w:color w:val="1B1915"/>
+          <w:color w:val="333333"/>
           <w:sz w:val="19"/>
         </w:rPr>
         <w:t>full marketing plan</w:t>
@@ -246,7 +218,7 @@
         <w:rPr>
           <w:b w:val="0"/>
           <w:i w:val="0"/>
-          <w:color w:val="1B1915"/>
+          <w:color w:val="333333"/>
           <w:sz w:val="19"/>
         </w:rPr>
         <w:t xml:space="preserve">, create the </w:t>
@@ -255,7 +227,7 @@
         <w:rPr>
           <w:b/>
           <w:i w:val="0"/>
-          <w:color w:val="1B1915"/>
+          <w:color w:val="333333"/>
           <w:sz w:val="19"/>
         </w:rPr>
         <w:t>visuals and high-end 2D motion graphics</w:t>
@@ -264,7 +236,7 @@
         <w:rPr>
           <w:b w:val="0"/>
           <w:i w:val="0"/>
-          <w:color w:val="1B1915"/>
+          <w:color w:val="333333"/>
           <w:sz w:val="19"/>
         </w:rPr>
         <w:t xml:space="preserve"> that bring it to life, and </w:t>
@@ -273,7 +245,7 @@
         <w:rPr>
           <w:b/>
           <w:i w:val="0"/>
-          <w:color w:val="1B1915"/>
+          <w:color w:val="333333"/>
           <w:sz w:val="19"/>
         </w:rPr>
         <w:t>run it as paid campaigns on Meta ads</w:t>
@@ -282,27 +254,45 @@
         <w:rPr>
           <w:b w:val="0"/>
           <w:i w:val="0"/>
-          <w:color w:val="1B1915"/>
+          <w:color w:val="333333"/>
           <w:sz w:val="19"/>
         </w:rPr>
-        <w:t>. One person, the complete funnel: plan it, design it, launch it, and grow it with measurable, revenue-focused results.</w:t>
+        <w:t>. One person, the complete funnel: plan it, design it, launch it, and grow it with measurable, revenue-focused results. Excellent written English (</w:t>
+      </w:r>
+      <w:r>
+        <w:rPr>
+          <w:b/>
+          <w:i w:val="0"/>
+          <w:color w:val="333333"/>
+          <w:sz w:val="19"/>
+        </w:rPr>
+        <w:t>C2 Proficient, EF SET 86/100</w:t>
+      </w:r>
+      <w:r>
+        <w:rPr>
+          <w:b w:val="0"/>
+          <w:i w:val="0"/>
+          <w:color w:val="333333"/>
+          <w:sz w:val="19"/>
+        </w:rPr>
+        <w:t>).</w:t>
       </w:r>
     </w:p>
     <w:p>
       <w:pPr>
-        <w:spacing w:before="180" w:after="60"/>
+        <w:spacing w:before="160" w:after="60"/>
         <w:pBdr>
-          <w:bottom w:val="single" w:sz="6" w:space="2" w:color="b4892c"/>
+          <w:bottom w:val="single" w:sz="6" w:space="2" w:color="c9c9c9"/>
         </w:pBdr>
       </w:pPr>
       <w:r>
         <w:rPr>
           <w:b/>
           <w:i w:val="0"/>
-          <w:color w:val="1B1915"/>
+          <w:color w:val="1A1A1A"/>
           <w:sz w:val="22"/>
         </w:rPr>
-        <w:t>CORE SKILLS</w:t>
+        <w:t>SKILLS</w:t>
       </w:r>
     </w:p>
     <w:p>
@@ -313,7 +303,7 @@
         <w:rPr>
           <w:b w:val="0"/>
           <w:i w:val="0"/>
-          <w:color w:val="1B1915"/>
+          <w:color w:val="333333"/>
           <w:sz w:val="19"/>
         </w:rPr>
         <w:t>Digital Marketing · Social Media Marketing · Content Strategy · Brand Identity &amp; Branding · Graphic Design · 2D Motion Graphics · Video Editing · Paid Media (Meta &amp; Google Ads) · SEO · Marketing Funnels &amp; Full-Funnel Strategy · Email Marketing &amp; Automation · Marketing Automation (n8n) · AI-Assisted Design · Campaign Management · Copywriting · Analytics &amp; Reporting · Logo &amp; Character Animation · Packaging &amp; Print Design</w:t>
@@ -321,19 +311,19 @@
     </w:p>
     <w:p>
       <w:pPr>
-        <w:spacing w:before="180" w:after="60"/>
+        <w:spacing w:before="160" w:after="60"/>
         <w:pBdr>
-          <w:bottom w:val="single" w:sz="6" w:space="2" w:color="b4892c"/>
+          <w:bottom w:val="single" w:sz="6" w:space="2" w:color="c9c9c9"/>
         </w:pBdr>
       </w:pPr>
       <w:r>
         <w:rPr>
           <w:b/>
           <w:i w:val="0"/>
-          <w:color w:val="1B1915"/>
+          <w:color w:val="1A1A1A"/>
           <w:sz w:val="22"/>
         </w:rPr>
-        <w:t>PROFESSIONAL EXPERIENCE</w:t>
+        <w:t>WORK EXPERIENCE</w:t>
       </w:r>
     </w:p>
     <w:p>
@@ -344,7 +334,7 @@
         <w:rPr>
           <w:b/>
           <w:i w:val="0"/>
-          <w:color w:val="1B1915"/>
+          <w:color w:val="1A1A1A"/>
           <w:sz w:val="20"/>
         </w:rPr>
         <w:t xml:space="preserve">Digital Marketing Specialist </w:t>
@@ -353,7 +343,7 @@
         <w:rPr>
           <w:b/>
           <w:i w:val="0"/>
-          <w:color w:val="8A6414"/>
+          <w:color w:val="333333"/>
           <w:sz w:val="20"/>
         </w:rPr>
         <w:t>— SalesShortcut AI Marketing Agency</w:t>
@@ -367,7 +357,7 @@
         <w:rPr>
           <w:b w:val="0"/>
           <w:i/>
-          <w:color w:val="55504A"/>
+          <w:color w:val="555555"/>
           <w:sz w:val="17"/>
         </w:rPr>
         <w:t>Remote (US) · Apr 2026 – Present</w:t>
@@ -382,7 +372,7 @@
         <w:rPr>
           <w:b w:val="0"/>
           <w:i w:val="0"/>
-          <w:color w:val="1B1915"/>
+          <w:color w:val="333333"/>
           <w:sz w:val="19"/>
         </w:rPr>
         <w:t>Lead brand and marketing direction for a US-based SaaS company, owning social media strategy, creative production and paid campaigns.</w:t>
@@ -397,7 +387,7 @@
         <w:rPr>
           <w:b w:val="0"/>
           <w:i w:val="0"/>
-          <w:color w:val="1B1915"/>
+          <w:color w:val="333333"/>
           <w:sz w:val="19"/>
         </w:rPr>
         <w:t>Grew a brand-new account from zero: +684.9% LinkedIn impressions in 30 days, plus +396% Instagram reach (932 accounts), +298% content views (2.8K) and +181% content interactions (205) — all through organic social.</w:t>
@@ -412,7 +402,7 @@
         <w:rPr>
           <w:b w:val="0"/>
           <w:i w:val="0"/>
-          <w:color w:val="1B1915"/>
+          <w:color w:val="333333"/>
           <w:sz w:val="19"/>
         </w:rPr>
         <w:t>Designed a four-step email outreach sequence and built an automated n8n + AI workflow that finds leads, extracts emails, personalizes each message with AI and sends them — a full lead-generation pipeline.</w:t>
@@ -427,10 +417,10 @@
         <w:rPr>
           <w:b w:val="0"/>
           <w:i w:val="0"/>
-          <w:color w:val="1B1915"/>
+          <w:color w:val="333333"/>
           <w:sz w:val="19"/>
         </w:rPr>
-        <w:t>Built an AI Marketing Agent in n8n (Google Gemini) that analyzes a business, its competitors and niche, then returns a marketing funnel, promotion plan and first 10 growth steps.</w:t>
+        <w:t>Built an AI Marketing Agent in n8n that analyzes a business, its competitors and niche, then returns a marketing funnel, promotion plan and first 10 growth steps.</w:t>
       </w:r>
     </w:p>
     <w:p>
@@ -441,7 +431,7 @@
         <w:rPr>
           <w:b/>
           <w:i w:val="0"/>
-          <w:color w:val="1B1915"/>
+          <w:color w:val="1A1A1A"/>
           <w:sz w:val="20"/>
         </w:rPr>
         <w:t xml:space="preserve">Motion Designer </w:t>
@@ -450,7 +440,7 @@
         <w:rPr>
           <w:b/>
           <w:i w:val="0"/>
-          <w:color w:val="8A6414"/>
+          <w:color w:val="333333"/>
           <w:sz w:val="20"/>
         </w:rPr>
         <w:t>— Great Silk Road Network</w:t>
@@ -464,7 +454,7 @@
         <w:rPr>
           <w:b w:val="0"/>
           <w:i/>
-          <w:color w:val="55504A"/>
+          <w:color w:val="555555"/>
           <w:sz w:val="17"/>
         </w:rPr>
         <w:t>Ashgabat, Turkmenistan · Mar 2026 – Present</w:t>
@@ -479,10 +469,10 @@
         <w:rPr>
           <w:b w:val="0"/>
           <w:i w:val="0"/>
-          <w:color w:val="1B1915"/>
+          <w:color w:val="333333"/>
           <w:sz w:val="19"/>
         </w:rPr>
-        <w:t>Produce 2D motion graphics, logo animations and social video content for brand campaigns.</w:t>
+        <w:t>Produce 2D motion graphics, logo animations and social video content for brand campaigns across DHL Turkmenistan, GSR Network and Toyota BYY.</w:t>
       </w:r>
     </w:p>
     <w:p>
@@ -494,10 +484,10 @@
         <w:rPr>
           <w:b w:val="0"/>
           <w:i w:val="0"/>
-          <w:color w:val="1B1915"/>
+          <w:color w:val="333333"/>
           <w:sz w:val="19"/>
         </w:rPr>
-        <w:t>Deliver daily motion and static creative aligned to content calendars and publishing schedules.</w:t>
+        <w:t>Run paid Meta (Facebook / Instagram) campaigns and deliver daily motion and static creative aligned to content calendars.</w:t>
       </w:r>
     </w:p>
     <w:p>
@@ -508,7 +498,7 @@
         <w:rPr>
           <w:b/>
           <w:i w:val="0"/>
-          <w:color w:val="1B1915"/>
+          <w:color w:val="1A1A1A"/>
           <w:sz w:val="20"/>
         </w:rPr>
         <w:t xml:space="preserve">Graphic &amp; Motion Designer </w:t>
@@ -517,7 +507,7 @@
         <w:rPr>
           <w:b/>
           <w:i w:val="0"/>
-          <w:color w:val="8A6414"/>
+          <w:color w:val="333333"/>
           <w:sz w:val="20"/>
         </w:rPr>
         <w:t>— Freelance</w:t>
@@ -531,7 +521,7 @@
         <w:rPr>
           <w:b w:val="0"/>
           <w:i/>
-          <w:color w:val="55504A"/>
+          <w:color w:val="555555"/>
           <w:sz w:val="17"/>
         </w:rPr>
         <w:t>Remote · Jan 2026 – Present</w:t>
@@ -546,7 +536,7 @@
         <w:rPr>
           <w:b w:val="0"/>
           <w:i w:val="0"/>
-          <w:color w:val="1B1915"/>
+          <w:color w:val="333333"/>
           <w:sz w:val="19"/>
         </w:rPr>
         <w:t>Provide end-to-end graphic design and 2D motion graphics for founders and small businesses, turning briefs into scroll-stopping social creative, ad sets and brand assets.</w:t>
@@ -560,7 +550,7 @@
         <w:rPr>
           <w:b/>
           <w:i w:val="0"/>
-          <w:color w:val="1B1915"/>
+          <w:color w:val="1A1A1A"/>
           <w:sz w:val="20"/>
         </w:rPr>
         <w:t xml:space="preserve">Graphic &amp; Motion Designer </w:t>
@@ -569,7 +559,7 @@
         <w:rPr>
           <w:b/>
           <w:i w:val="0"/>
-          <w:color w:val="8A6414"/>
+          <w:color w:val="333333"/>
           <w:sz w:val="20"/>
         </w:rPr>
         <w:t>— 100haryt.com (E-commerce)</w:t>
@@ -583,7 +573,7 @@
         <w:rPr>
           <w:b w:val="0"/>
           <w:i/>
-          <w:color w:val="55504A"/>
+          <w:color w:val="555555"/>
           <w:sz w:val="17"/>
         </w:rPr>
         <w:t>Ashgabat, Turkmenistan · Jun 2023 – Jan 2026</w:t>
@@ -598,10 +588,10 @@
         <w:rPr>
           <w:b w:val="0"/>
           <w:i w:val="0"/>
-          <w:color w:val="1B1915"/>
+          <w:color w:val="333333"/>
           <w:sz w:val="19"/>
         </w:rPr>
-        <w:t>Designed landing-page banners, promotional creatives and daily social media posts for an e-commerce marketplace.</w:t>
+        <w:t>Designed landing-page banners, promotional creatives and daily social media posts for a 100,000+ product e-commerce marketplace.</w:t>
       </w:r>
     </w:p>
     <w:p>
@@ -613,10 +603,10 @@
         <w:rPr>
           <w:b w:val="0"/>
           <w:i w:val="0"/>
-          <w:color w:val="1B1915"/>
+          <w:color w:val="333333"/>
           <w:sz w:val="19"/>
         </w:rPr>
-        <w:t>Produced full-funnel social content and paid-ad creative that supported brand visibility and sales.</w:t>
+        <w:t>Produced full-funnel social content and paid-ad creative that supported brand visibility and sales. Named Employee of the Year (2024).</w:t>
       </w:r>
     </w:p>
     <w:p>
@@ -627,7 +617,7 @@
         <w:rPr>
           <w:b/>
           <w:i w:val="0"/>
-          <w:color w:val="1B1915"/>
+          <w:color w:val="1A1A1A"/>
           <w:sz w:val="20"/>
         </w:rPr>
         <w:t xml:space="preserve">Graphic Designer </w:t>
@@ -636,7 +626,7 @@
         <w:rPr>
           <w:b/>
           <w:i w:val="0"/>
-          <w:color w:val="8A6414"/>
+          <w:color w:val="333333"/>
           <w:sz w:val="20"/>
         </w:rPr>
         <w:t>— Taze Market (E-commerce)</w:t>
@@ -650,7 +640,7 @@
         <w:rPr>
           <w:b w:val="0"/>
           <w:i/>
-          <w:color w:val="55504A"/>
+          <w:color w:val="555555"/>
           <w:sz w:val="17"/>
         </w:rPr>
         <w:t>Ashgabat, Turkmenistan · May 2021 – Mar 2023</w:t>
@@ -665,80 +655,24 @@
         <w:rPr>
           <w:b w:val="0"/>
           <w:i w:val="0"/>
-          <w:color w:val="1B1915"/>
+          <w:color w:val="333333"/>
           <w:sz w:val="19"/>
         </w:rPr>
-        <w:t>Created social media ads, promotional graphics and print design for a retail e-commerce brand.</w:t>
+        <w:t>Created social media ads, promotional graphics and print design for a retail e-commerce brand, keeping visuals consistent across digital and printed channels.</w:t>
       </w:r>
     </w:p>
     <w:p>
       <w:pPr>
-        <w:pStyle w:val="ListBullet"/>
-        <w:spacing w:before="0" w:after="20" w:line="252" w:lineRule="auto"/>
-      </w:pPr>
-      <w:r>
-        <w:rPr>
-          <w:b w:val="0"/>
-          <w:i w:val="0"/>
-          <w:color w:val="1B1915"/>
-          <w:sz w:val="19"/>
-        </w:rPr>
-        <w:t>Delivered consistent brand visuals across digital and printed channels.</w:t>
-      </w:r>
-    </w:p>
-    <w:p>
-      <w:pPr>
-        <w:spacing w:before="180" w:after="60"/>
+        <w:spacing w:before="160" w:after="60"/>
         <w:pBdr>
-          <w:bottom w:val="single" w:sz="6" w:space="2" w:color="b4892c"/>
+          <w:bottom w:val="single" w:sz="6" w:space="2" w:color="c9c9c9"/>
         </w:pBdr>
       </w:pPr>
       <w:r>
         <w:rPr>
           <w:b/>
           <w:i w:val="0"/>
-          <w:color w:val="1B1915"/>
-          <w:sz w:val="22"/>
-        </w:rPr>
-        <w:t>KEY ACHIEVEMENTS</w:t>
-      </w:r>
-    </w:p>
-    <w:p>
-      <w:pPr>
-        <w:pStyle w:val="ListBullet"/>
-        <w:spacing w:before="0" w:after="20"/>
-      </w:pPr>
-      <w:r>
-        <w:rPr>
-          <w:b/>
-          <w:i w:val="0"/>
-          <w:color w:val="1B1915"/>
-          <w:sz w:val="19"/>
-        </w:rPr>
-        <w:t>Employee of the Year</w:t>
-      </w:r>
-      <w:r>
-        <w:rPr>
-          <w:b w:val="0"/>
-          <w:i w:val="0"/>
-          <w:color w:val="1B1915"/>
-          <w:sz w:val="19"/>
-        </w:rPr>
-        <w:t xml:space="preserve"> — 100haryt.com, 2024 — recognized for consistent, high-impact delivery and reliability.</w:t>
-      </w:r>
-    </w:p>
-    <w:p>
-      <w:pPr>
-        <w:spacing w:before="180" w:after="60"/>
-        <w:pBdr>
-          <w:bottom w:val="single" w:sz="6" w:space="2" w:color="b4892c"/>
-        </w:pBdr>
-      </w:pPr>
-      <w:r>
-        <w:rPr>
-          <w:b/>
-          <w:i w:val="0"/>
-          <w:color w:val="1B1915"/>
+          <w:color w:val="1A1A1A"/>
           <w:sz w:val="22"/>
         </w:rPr>
         <w:t>EDUCATION</w:t>
@@ -752,16 +686,16 @@
         <w:rPr>
           <w:b/>
           <w:i w:val="0"/>
-          <w:color w:val="1B1915"/>
+          <w:color w:val="1A1A1A"/>
           <w:sz w:val="20"/>
         </w:rPr>
-        <w:t xml:space="preserve">International Economics </w:t>
+        <w:t xml:space="preserve">BA, International Economics </w:t>
       </w:r>
       <w:r>
         <w:rPr>
           <w:b/>
           <w:i w:val="0"/>
-          <w:color w:val="8A6414"/>
+          <w:color w:val="333333"/>
           <w:sz w:val="20"/>
         </w:rPr>
         <w:t>— International University for the Humanities and Development</w:t>
@@ -775,7 +709,7 @@
         <w:rPr>
           <w:b w:val="0"/>
           <w:i/>
-          <w:color w:val="55504A"/>
+          <w:color w:val="555555"/>
           <w:sz w:val="17"/>
         </w:rPr>
         <w:t>Ashgabat, Turkmenistan · 2020 – 2025</w:t>
@@ -783,72 +717,19 @@
     </w:p>
     <w:p>
       <w:pPr>
-        <w:spacing w:before="180" w:after="60"/>
+        <w:spacing w:before="160" w:after="60"/>
         <w:pBdr>
-          <w:bottom w:val="single" w:sz="6" w:space="2" w:color="b4892c"/>
+          <w:bottom w:val="single" w:sz="6" w:space="2" w:color="c9c9c9"/>
         </w:pBdr>
       </w:pPr>
       <w:r>
         <w:rPr>
           <w:b/>
           <w:i w:val="0"/>
-          <w:color w:val="1B1915"/>
+          <w:color w:val="1A1A1A"/>
           <w:sz w:val="22"/>
         </w:rPr>
         <w:t>CERTIFICATIONS</w:t>
-      </w:r>
-    </w:p>
-    <w:p>
-      <w:pPr>
-        <w:pStyle w:val="ListBullet"/>
-        <w:spacing w:after="20" w:line="252" w:lineRule="auto"/>
-      </w:pPr>
-      <w:r>
-        <w:rPr>
-          <w:b/>
-          <w:sz w:val="19"/>
-        </w:rPr>
-        <w:t>EF SET English Certificate — C2 Proficient (86/100)</w:t>
-      </w:r>
-      <w:r>
-        <w:rPr>
-          <w:sz w:val="19"/>
-        </w:rPr>
-        <w:t xml:space="preserve"> — EF Standard English Test, Aug 2026 · </w:t>
-      </w:r>
-      <w:hyperlink r:id="rId13">
-        <w:r>
-          <w:rPr>
-            <w:color w:val="8A6414"/>
-            <w:u w:val="single"/>
-            <w:sz w:val="18"/>
-          </w:rPr>
-          <w:t xml:space="preserve">cert.efset.org/chQboN</w:t>
-        </w:r>
-      </w:hyperlink>
-    </w:p>
-    <w:p>
-      <w:pPr>
-        <w:pStyle w:val="ListBullet"/>
-        <w:spacing w:before="0" w:after="20"/>
-      </w:pPr>
-      <w:r>
-        <w:rPr>
-          <w:b/>
-          <w:i w:val="0"/>
-          <w:color w:val="1B1915"/>
-          <w:sz w:val="19"/>
-        </w:rPr>
-        <w:t>Foundations of Digital Marketing and E-commerce</w:t>
-      </w:r>
-      <w:r>
-        <w:rPr>
-          <w:b w:val="0"/>
-          <w:i w:val="0"/>
-          <w:color w:val="1B1915"/>
-          <w:sz w:val="19"/>
-        </w:rPr>
-        <w:t xml:space="preserve"> — Google, via Coursera (Jul 2026) · Credential ID 87MSN1234K9L</w:t>
       </w:r>
     </w:p>
     <w:p>
@@ -860,7 +741,65 @@
         <w:rPr>
           <w:b/>
           <w:i w:val="0"/>
-          <w:color w:val="1B1915"/>
+          <w:color w:val="1A1A1A"/>
+          <w:sz w:val="19"/>
+        </w:rPr>
+        <w:t>EF SET English Certificate — C2 Proficient (86/100)</w:t>
+      </w:r>
+      <w:r>
+        <w:rPr>
+          <w:b w:val="0"/>
+          <w:i w:val="0"/>
+          <w:color w:val="333333"/>
+          <w:sz w:val="19"/>
+        </w:rPr>
+        <w:t xml:space="preserve"> — EF Standard English Test, Aug 2026 · </w:t>
+      </w:r>
+      <w:hyperlink r:id="rId13">
+        <w:r>
+          <w:rPr>
+            <w:color w:val="12457A"/>
+            <w:u w:val="single"/>
+            <w:sz w:val="18"/>
+          </w:rPr>
+          <w:t xml:space="preserve">cert.efset.org/chQboN</w:t>
+        </w:r>
+      </w:hyperlink>
+    </w:p>
+    <w:p>
+      <w:pPr>
+        <w:pStyle w:val="ListBullet"/>
+        <w:spacing w:before="0" w:after="20" w:line="252" w:lineRule="auto"/>
+      </w:pPr>
+      <w:r>
+        <w:rPr>
+          <w:b/>
+          <w:i w:val="0"/>
+          <w:color w:val="333333"/>
+          <w:sz w:val="19"/>
+        </w:rPr>
+        <w:t>Foundations of Digital Marketing and E-commerce</w:t>
+      </w:r>
+      <w:r>
+        <w:rPr>
+          <w:b w:val="0"/>
+          <w:i w:val="0"/>
+          <w:color w:val="333333"/>
+          <w:sz w:val="19"/>
+        </w:rPr>
+        <w:t xml:space="preserve"> — Google, via Coursera (Jul 2026) · Credential ID 87MSN1234K9L</w:t>
+      </w:r>
+    </w:p>
+    <w:p>
+      <w:pPr>
+        <w:pStyle w:val="ListBullet"/>
+        <w:spacing w:before="0" w:after="20" w:line="252" w:lineRule="auto"/>
+      </w:pPr>
+      <w:r>
+        <w:rPr>
+          <w:b/>
+          <w:i w:val="0"/>
+          <w:color w:val="333333"/>
           <w:sz w:val="19"/>
         </w:rPr>
         <w:t>Digital Marketing</w:t>
@@ -869,7 +808,7 @@
         <w:rPr>
           <w:b w:val="0"/>
           <w:i w:val="0"/>
-          <w:color w:val="1B1915"/>
+          <w:color w:val="333333"/>
           <w:sz w:val="19"/>
         </w:rPr>
         <w:t xml:space="preserve"> — Illinois Tech, via Coursera (Jul 2026) · Credential ID Y6LUWHGLYZ0W</w:t>
@@ -878,13 +817,13 @@
     <w:p>
       <w:pPr>
         <w:pStyle w:val="ListBullet"/>
-        <w:spacing w:before="0" w:after="20"/>
+        <w:spacing w:before="0" w:after="20" w:line="252" w:lineRule="auto"/>
       </w:pPr>
       <w:r>
         <w:rPr>
           <w:b/>
           <w:i w:val="0"/>
-          <w:color w:val="1B1915"/>
+          <w:color w:val="333333"/>
           <w:sz w:val="19"/>
         </w:rPr>
         <w:t>Capstone Project: Digital Marketing and Growth Hacking</w:t>
@@ -893,7 +832,7 @@
         <w:rPr>
           <w:b w:val="0"/>
           <w:i w:val="0"/>
-          <w:color w:val="1B1915"/>
+          <w:color w:val="333333"/>
           <w:sz w:val="19"/>
         </w:rPr>
         <w:t xml:space="preserve"> — IBM, via Coursera (Jul 2026) · Credential ID KNU8XV50HUZX</w:t>
@@ -901,19 +840,42 @@
     </w:p>
     <w:p>
       <w:pPr>
-        <w:spacing w:before="180" w:after="60"/>
+        <w:spacing w:before="160" w:after="60"/>
         <w:pBdr>
-          <w:bottom w:val="single" w:sz="6" w:space="2" w:color="b4892c"/>
+          <w:bottom w:val="single" w:sz="6" w:space="2" w:color="c9c9c9"/>
         </w:pBdr>
       </w:pPr>
       <w:r>
         <w:rPr>
           <w:b/>
           <w:i w:val="0"/>
-          <w:color w:val="1B1915"/>
+          <w:color w:val="1A1A1A"/>
           <w:sz w:val="22"/>
         </w:rPr>
-        <w:t>TOOLS &amp; TECHNOLOGIES</w:t>
+        <w:t>TOOLS &amp; LANGUAGES</w:t>
+      </w:r>
+    </w:p>
+    <w:p>
+      <w:pPr>
+        <w:spacing w:before="0" w:after="20"/>
+      </w:pPr>
+      <w:r>
+        <w:rPr>
+          <w:b/>
+          <w:i w:val="0"/>
+          <w:color w:val="1A1A1A"/>
+          <w:sz w:val="19"/>
+        </w:rPr>
+        <w:t xml:space="preserve">Tools: </w:t>
+      </w:r>
+      <w:r>
+        <w:rPr>
+          <w:b w:val="0"/>
+          <w:i w:val="0"/>
+          <w:color w:val="333333"/>
+          <w:sz w:val="19"/>
+        </w:rPr>
+        <w:t>Adobe After Effects · Photoshop · Illustrator · Premiere Pro · Lightroom · Figma · Canva · n8n · Meta &amp; Google Ads</w:t>
       </w:r>
     </w:p>
     <w:p>
@@ -922,40 +884,18 @@
       </w:pPr>
       <w:r>
         <w:rPr>
-          <w:b w:val="0"/>
+          <w:b/>
           <w:i w:val="0"/>
-          <w:color w:val="1B1915"/>
+          <w:color w:val="1A1A1A"/>
           <w:sz w:val="19"/>
         </w:rPr>
-        <w:t>Adobe After Effects · Adobe Photoshop · Adobe Illustrator · Adobe Premiere Pro · Adobe Lightroom · Figma · Canva · n8n · Google Gemini</w:t>
+        <w:t xml:space="preserve">Languages: </w:t>
       </w:r>
-    </w:p>
-    <w:p>
-      <w:pPr>
-        <w:spacing w:before="180" w:after="60"/>
-        <w:pBdr>
-          <w:bottom w:val="single" w:sz="6" w:space="2" w:color="b4892c"/>
-        </w:pBdr>
-      </w:pPr>
-      <w:r>
-        <w:rPr>
-          <w:b/>
-          <w:i w:val="0"/>
-          <w:color w:val="1B1915"/>
-          <w:sz w:val="22"/>
-        </w:rPr>
-        <w:t>LANGUAGES</w:t>
-      </w:r>
-    </w:p>
-    <w:p>
-      <w:pPr>
-        <w:spacing w:before="0" w:after="40"/>
-      </w:pPr>
       <w:r>
         <w:rPr>
           <w:b w:val="0"/>
           <w:i w:val="0"/>
-          <w:color w:val="1B1915"/>
+          <w:color w:val="333333"/>
           <w:sz w:val="19"/>
         </w:rPr>
         <w:t>English — C2 Proficient (EF SET 86/100) · Turkmen — Native · Russian — Fluent · Turkish — Fluent</w:t>
@@ -963,7 +903,7 @@
     </w:p>
     <w:sectPr>
       <w:pgSz w:w="12240" w:h="15840"/>
-      <w:pgMar w:top="680" w:right="800" w:bottom="680" w:left="800" w:header="720" w:footer="720" w:gutter="0"/>
+      <w:pgMar w:top="720" w:right="840" w:bottom="600" w:left="840" w:header="720" w:footer="720" w:gutter="0"/>
       <w:cols w:space="720"/>
       <w:docGrid w:linePitch="360"/>
     </w:sectPr>
@@ -1336,7 +1276,7 @@
     <w:rsid w:val="00FC693F"/>
     <w:rPr>
       <w:rFonts w:ascii="Arial" w:hAnsi="Arial"/>
-      <w:color w:val="1B1915"/>
+      <w:color w:val="1A1A1A"/>
       <w:sz w:val="20"/>
     </w:rPr>
   </w:style>

</xml_diff>